<commit_message>
Short page v2: polished text (external AI pass) + gold cards hero strip
- presentation-short.docx: adopted the recommended polished wording
- 4 gold cards under hero: ~$90K equity / built new home / independent
  LLC ownership / selected growth neighborhoods
- New hero subtitle; risk note now renders both paragraphs
- Full page output unchanged

Co-Authored-By: Claude Fable 5 <noreply@anthropic.com>
</commit_message>
<xml_diff>
--- a/presentation-short.docx
+++ b/presentation-short.docx
@@ -25,7 +25,7 @@
           <w:sz w:val="24"/>
           <w:rtl w:val="1"/>
         </w:rPr>
-        <w:t>התמונה בקצרה - עיקרי המודל בכמה דקות קריאה</w:t>
+        <w:t>המודל בקצרה - בית בנוי, בעלות עצמאית ותהליך מסודר</w:t>
       </w:r>
     </w:p>
     <w:p>
@@ -51,7 +51,7 @@
           <w:sz w:val="24"/>
           <w:rtl w:val="1"/>
         </w:rPr>
-        <w:t>אנחנו קבוצת יזמים עצמאית, הפועלת בנדל״ן למעלה מחמש עשרה שנה. אחרי בחינה מעמיקה של כמה מסלולי השקעה, הגענו למודל של רכישת בתים חדשים מקבלנים ציבוריים גדולים בטקסס: נכס אמיתי, בעלות ברורה, תהליך מסודר ואפשרות להחזיק לאורך זמן.</w:t>
+        <w:t>אנחנו קבוצת יזמים עצמאית, הפועלת בנדל״ן למעלה מחמש עשרה שנה. לאחר שבחנו לעומק כמה מסלולי השקעה, בחרנו להתמקד ברכישת בתים חדשים מקבלנים ציבוריים גדולים בטקסס: נכס אמיתי, בעלות ברורה, תהליך מסודר ואפשרות להחזיק לאורך זמן.</w:t>
       </w:r>
     </w:p>
     <w:p>
@@ -64,7 +64,7 @@
           <w:sz w:val="24"/>
           <w:rtl w:val="1"/>
         </w:rPr>
-        <w:t>• בית חדש מקבלן ציבורי גדול, בשכונות חדשות ומתוכננות באזור יוסטון רבתי.</w:t>
+        <w:t>• בית חד-משפחתי חדש מקבלן ציבורי גדול, בשכונות חדשות ומתוכננות באזור יוסטון רבתי.</w:t>
       </w:r>
     </w:p>
     <w:p>
@@ -77,7 +77,7 @@
           <w:sz w:val="24"/>
           <w:rtl w:val="1"/>
         </w:rPr>
-        <w:t>• בעלות מלאה ועצמאית: LLC ייעודית בבעלות המשקיע, חשבון בנק של החברה, והנכס רשום על שם החברה. לא קרן ולא קופה משותפת.</w:t>
+        <w:t>• בעלות עצמאית: LLC ייעודית בבעלות המשקיע, חשבון בנק של החברה והנכס רשום על שמה. לא קרן ולא קופה משותפת.</w:t>
       </w:r>
     </w:p>
     <w:p>
@@ -90,7 +90,7 @@
           <w:sz w:val="24"/>
           <w:rtl w:val="1"/>
         </w:rPr>
-        <w:t>• נקודת כניסה בשלב שבו הנכס כבר קיים - ניתן לבדיקה הנדסית, לבחינת מימון ולהשכרה בפרק זמן קצר יחסית.</w:t>
+        <w:t>• נקודת הכניסה היא לאחר שהבית כבר קיים - ניתן לבצע Inspection, לבחון מימון ולהעביר אותו להשכרה בפרק זמן קצר יחסית.</w:t>
       </w:r>
     </w:p>
     <w:p>
@@ -116,7 +116,7 @@
           <w:sz w:val="24"/>
           <w:rtl w:val="1"/>
         </w:rPr>
-        <w:t>סביבת הריבית הגבוהה יצרה לחץ גם על קבלנים ציבוריים גדולים, שמחזיקים מלאי משמעותי של בתים חדשים ומחויבים להמשיך למכור. בפגישות שקיימנו בשטח ראינו נכונות גבוהה מהרגיל להעניק הטבות, שדרוגים וסיוע בעלויות סגירה - במיוחד מול קבוצת משקיעים מסודרת, מוכנה ועם הון זמין.</w:t>
+        <w:t>סביבת הריבית הגבוהה יצרה לחץ גם אצל קבלנים ציבוריים גדולים, שמחזיקים מלאי של בתים חדשים ונדרשים להמשיך למכור. בפגישות שקיימנו עם קבלנים ואנשי מקצוע מקומיים ראינו שבחלק מהמקרים קיימת נכונות גבוהה יותר להציע הטבות, שדרוגים או סיוע בעלויות סגירה. כשהמשקיע מגיע מוכן, עם תשתית מסודרת והון זמין, אפשר לבחון את תנאי העסקה מנקודת פתיחה טובה יותר.</w:t>
       </w:r>
     </w:p>
     <w:p>
@@ -129,7 +129,7 @@
           <w:sz w:val="24"/>
           <w:rtl w:val="1"/>
         </w:rPr>
-        <w:t>יוסטון נבחרה לפי פרמטרים מעשיים: גידול אוכלוסייה, תעסוקה מגוונת, ביקוש לשכירות, תשתיות, בתי ספר ושכונות חדשות שממשיכות להבשיל לאורך זמן.</w:t>
+        <w:t>באזור יוסטון רבתי אנחנו מתמקדים במיקומים שנבחנים לפי פרמטרים מעשיים: גידול אוכלוסייה, תעסוקה, ביקוש לשכירות, תשתיות, בתי ספר ושכונות חדשות שממשיכות להתאכלס ולהבשיל.</w:t>
       </w:r>
     </w:p>
     <w:p>
@@ -155,7 +155,7 @@
           <w:sz w:val="24"/>
           <w:rtl w:val="1"/>
         </w:rPr>
-        <w:t>הבחירה בבתים חדשים נובעת משילוב של כמה שכבות שמתחברות יחד:</w:t>
+        <w:t>הבחירה בבית חדש נובעת משילוב של כמה יתרונות מעשיים:</w:t>
       </w:r>
     </w:p>
     <w:p>
@@ -168,7 +168,7 @@
           <w:sz w:val="24"/>
           <w:rtl w:val="1"/>
         </w:rPr>
-        <w:t>• בית חדש מקבלן גדול ומבוסס - לא נכס ישן שדורש הערכת תחזוקה עמוקה כבר ביום הראשון.</w:t>
+        <w:t>• בית חדש מקבלן גדול ומבוסס - נקודת פתיחה ברורה יותר מנכס ישן שדורש הערכת תחזוקה עמוקה כבר ביום הראשון.</w:t>
       </w:r>
     </w:p>
     <w:p>
@@ -181,7 +181,7 @@
           <w:sz w:val="24"/>
           <w:rtl w:val="1"/>
         </w:rPr>
-        <w:t>• אחריות קבלן בשנים הראשונות, ובדק בית מסודר מול הקבלן לפני המסירה.</w:t>
+        <w:t>• אחריות קבלן בשנים הראשונות, בהתאם לתנאים הרלוונטיים, ו-Inspection מסודר לפני המסירה.</w:t>
       </w:r>
     </w:p>
     <w:p>
@@ -194,7 +194,7 @@
           <w:sz w:val="24"/>
           <w:rtl w:val="1"/>
         </w:rPr>
-        <w:t>• אפשרות לבחון מימון מסוג DSCR במקרים מתאימים - הלוואה שנשענת בעיקר על הכנסות הנכס, לא על הכנסות המשקיע.</w:t>
+        <w:t>• אפשרות לבחון מימון מסוג DSCR במקרים מתאימים ובכפוף לאישור מלווה - הלוואה שמבוססת בעיקר על הכנסות הנכס.</w:t>
       </w:r>
     </w:p>
     <w:p>
@@ -207,7 +207,7 @@
           <w:sz w:val="24"/>
           <w:rtl w:val="1"/>
         </w:rPr>
-        <w:t>• אכלוס בשוכר בפרק זמן קצר יחסית לאחר הסגירה, במקום להמתין לתכנון ובנייה.</w:t>
+        <w:t>• אפשרות לאכלס את הבית בשוכר בפרק זמן קצר יחסית לאחר הסגירה, במקום להמתין לתכנון ולבנייה.</w:t>
       </w:r>
     </w:p>
     <w:p>
@@ -233,7 +233,7 @@
           <w:sz w:val="24"/>
           <w:rtl w:val="1"/>
         </w:rPr>
-        <w:t>זה לא הופך את ההשקעה לחסרת סיכון. את המודל בחנו קודם על עצמנו ובעסקאות ראשונות - לא רק ברמת אקסל.</w:t>
+        <w:t>זה לא הופך את ההשקעה לחסרת סיכון. את המודל בחנו קודם על עצמנו ובעסקאות ראשונות - לא רק ברמת האקסל, אלא גם ברכישה, בסגירה, בניהול ובהשכרה בפועל.</w:t>
       </w:r>
     </w:p>
     <w:p>
@@ -259,7 +259,7 @@
           <w:sz w:val="24"/>
           <w:rtl w:val="1"/>
         </w:rPr>
-        <w:t>התהליך בנוי בשלבים פשוטים יחסית:</w:t>
+        <w:t>התהליך בנוי בכמה שלבים ברורים:</w:t>
       </w:r>
     </w:p>
     <w:p>
@@ -298,7 +298,7 @@
           <w:sz w:val="24"/>
           <w:rtl w:val="1"/>
         </w:rPr>
-        <w:t>• העברת הון ראשוני לחשבון החברה, כדי לפעול במהירות כשנכס מתאים עולה.</w:t>
+        <w:t>• העברת הון ראשוני לחשבון החברה, כדי להיות מוכנים כאשר נכס מתאים עולה.</w:t>
       </w:r>
     </w:p>
     <w:p>
@@ -311,7 +311,7 @@
           <w:sz w:val="24"/>
           <w:rtl w:val="1"/>
         </w:rPr>
-        <w:t>• איתור נכס מתוך מלאי שעבר סינון מוקדם, בדיקות טייטל ואינספקשן, ביטוח והשלמת מימון במידת הצורך.</w:t>
+        <w:t>• איתור נכס מתוך מלאי שעבר סינון מוקדם, ולאחר מכן בדיקות Title, Inspection, ביטוח והשלמת מימון במידת הצורך.</w:t>
       </w:r>
     </w:p>
     <w:p>
@@ -324,7 +324,7 @@
           <w:sz w:val="24"/>
           <w:rtl w:val="1"/>
         </w:rPr>
-        <w:t>• סגירה, רישום הנכס על שם החברה, והעברה לחברת ניהול מקומית: פרסום, סינון שוכרים, גבייה ותחזוקה.</w:t>
+        <w:t>• סגירה, רישום הנכס על שם החברה והעברה לחברת ניהול מקומית לצורך פרסום, סינון שוכרים, גבייה ותחזוקה.</w:t>
       </w:r>
     </w:p>
     <w:p>
@@ -337,7 +337,7 @@
           <w:sz w:val="24"/>
           <w:rtl w:val="1"/>
         </w:rPr>
-        <w:t>משקיע שמגיע מוכן - עם חברה, חשבון בנק והון זמין - נתפס כרוכש רציני יותר מול הקבלנים, ולא מפספס נכס מתאים בגלל עיכוב טכני.</w:t>
+        <w:t>משקיע שמגיע עם חברה, חשבון בנק והון זמין נתפס כרוכש רציני יותר מול הקבלנים, ומקטין את הסיכון לפספס נכס מתאים בגלל עיכוב טכני.</w:t>
       </w:r>
     </w:p>
     <w:p>
@@ -363,7 +363,20 @@
           <w:sz w:val="24"/>
           <w:rtl w:val="1"/>
         </w:rPr>
-        <w:t>כמו בכל השקעת נדל״ן, יש משתנים שצריך לקחת בחשבון: תקופות ללא שוכר, תחזוקה, שינויי ריבית ומס, שינויי שוק והוצאות שלא ניתן לצפות מראש. בית חדש ואחריות קבלן אינם מבטלים את הסיכונים, אבל מאפשרים נקודת פתיחה מסודרת וברורה יותר. ההשקעה היא בנכס - לא בנו: המשקיע מחזיק את החברה, את חשבון הבנק ואת הבית.</w:t>
+        <w:t>כמו בכל השקעת נדל״ן, יש משתנים שצריך להביא בחשבון: תקופות ללא שוכר, תחזוקה, שינויי ריבית ומס, שינויי שוק והוצאות שלא ניתן לצפות מראש. בית חדש ואחריות קבלן אינם מבטלים את הסיכונים, אבל מאפשרים להתחיל מנקודת פתיחה מסודרת וברורה יותר.</w:t>
+      </w:r>
+    </w:p>
+    <w:p>
+      <w:pPr>
+        <w:bidi w:val="1"/>
+      </w:pPr>
+      <w:r>
+        <w:rPr>
+          <w:b w:val="0"/>
+          <w:sz w:val="24"/>
+          <w:rtl w:val="1"/>
+        </w:rPr>
+        <w:t>ההשקעה היא בנכס - לא בנו. המשקיע מחזיק ב-LLC ובחשבון הבנק, והבית רשום על שם החברה, בכפוף להסכמי הרכישה, המימון והדין הרלוונטי.</w:t>
       </w:r>
     </w:p>
     <w:p>

</xml_diff>

<commit_message>
Short page: gold cards v2 - Yossi's golden six
Six cards (nothing dropped; $90K merged into financing card):
built home from public builder / up to 70% financing at purchase /
independent single-family / Hebrew-speaking management / autonomous
LLC + account / selected growth neighborhoods. Body bullets updated
to carry the same facts (70% at purchase, Hebrew-speaking rep).

Co-Authored-By: Claude Fable 5 <noreply@anthropic.com>
</commit_message>
<xml_diff>
--- a/presentation-short.docx
+++ b/presentation-short.docx
@@ -194,7 +194,7 @@
           <w:sz w:val="24"/>
           <w:rtl w:val="1"/>
         </w:rPr>
-        <w:t>• אפשרות לבחון מימון מסוג DSCR במקרים מתאימים ובכפוף לאישור מלווה - הלוואה שמבוססת בעיקר על הכנסות הנכס.</w:t>
+        <w:t>• אפשרות לבחון מימון מסוג DSCR כבר בשלב הרכישה, עד כ-70% ובכפוף לאישור מלווה - משכנתא על שם ה-LLC בקנייה עצמה, לא ריפייננס מאוחר, והלוואה שמבוססת בעיקר על הכנסות הנכס.</w:t>
       </w:r>
     </w:p>
     <w:p>
@@ -208,6 +208,19 @@
           <w:rtl w:val="1"/>
         </w:rPr>
         <w:t>• אפשרות לאכלס את הבית בשוכר בפרק זמן קצר יחסית לאחר הסגירה, במקום להמתין לתכנון ולבנייה.</w:t>
+      </w:r>
+    </w:p>
+    <w:p>
+      <w:pPr>
+        <w:bidi w:val="1"/>
+      </w:pPr>
+      <w:r>
+        <w:rPr>
+          <w:b w:val="0"/>
+          <w:sz w:val="24"/>
+          <w:rtl w:val="1"/>
+        </w:rPr>
+        <w:t>• חברת ניהול ותיווך מקומית שמאתרת שוכר ומנהלת את הנכס בשטח, עם נציג דובר עברית שמגיע לישראל באופן קבוע - כך שהניהול מרחוק לא תלוי במיילים באנגלית.</w:t>
       </w:r>
     </w:p>
     <w:p>

</xml_diff>

<commit_message>
Short page: refined what-you-get bullets (Yossi polish pass)
Model-in-brief now carries the four upgraded bullets (built home from
public builder / independent LLC per investor / DSCR up to 70% at
purchase / local management with Hebrew response) plus the Hebrew-is-
not-just-convenience closer. Dropped the rough phrasings (Israel
visits, English-emails line) and the duplicate finance/management
bullets from why-new-home. Gold management card softened to match.

Co-Authored-By: Claude Fable 5 <noreply@anthropic.com>
</commit_message>
<xml_diff>
--- a/presentation-short.docx
+++ b/presentation-short.docx
@@ -64,7 +64,7 @@
           <w:sz w:val="24"/>
           <w:rtl w:val="1"/>
         </w:rPr>
-        <w:t>• בית חד-משפחתי חדש מקבלן ציבורי גדול, בשכונות חדשות ומתוכננות באזור יוסטון רבתי.</w:t>
+        <w:t>המודל מחבר בין נכס פשוט וברור לבין תשתית שמאפשרת למשקיע ישראלי להחזיק ולנהל אותו בצורה מסודרת גם מרחוק:</w:t>
       </w:r>
     </w:p>
     <w:p>
@@ -77,7 +77,7 @@
           <w:sz w:val="24"/>
           <w:rtl w:val="1"/>
         </w:rPr>
-        <w:t>• בעלות עצמאית: LLC ייעודית בבעלות המשקיע, חשבון בנק של החברה והנכס רשום על שמה. לא קרן ולא קופה משותפת.</w:t>
+        <w:t>• בית חד-משפחתי חדש, בנוי ומוכן, מקבלן ציבורי גדול. בלי קרקע, תכנון או תהליך בנייה - נכס שכבר קיים, ניתן לבדיקה, ויכול לעבור להשכרה בפרק זמן קצר יחסית.</w:t>
       </w:r>
     </w:p>
     <w:p>
@@ -90,7 +90,46 @@
           <w:sz w:val="24"/>
           <w:rtl w:val="1"/>
         </w:rPr>
-        <w:t>• נקודת הכניסה היא לאחר שהבית כבר קיים - ניתן לבצע Inspection, לבחון מימון ולהעביר אותו להשכרה בפרק זמן קצר יחסית.</w:t>
+        <w:t>• נכס עצמאי שאינו תלוי במשקיעים אחרים: לכל משקיע מוקמת LLC ייעודית בבעלותו, עם חשבון בנק נפרד, והבית נרשם על שם החברה שלו. אין קופה משותפת ואין תלות בהחלטות של קבוצה.</w:t>
+      </w:r>
+    </w:p>
+    <w:p>
+      <w:pPr>
+        <w:bidi w:val="1"/>
+      </w:pPr>
+      <w:r>
+        <w:rPr>
+          <w:b w:val="0"/>
+          <w:sz w:val="24"/>
+          <w:rtl w:val="1"/>
+        </w:rPr>
+        <w:t>• אפשרות לבחון מימון כבר במועד הרכישה: במקרים מתאימים ובכפוף לאישור המלווה, מימון DSCR בשיעור של עד 70% ממחיר הרכישה - כך שהמשקיע אינו נדרש בהכרח לממן את מלוא עלות הבית מהון עצמי.</w:t>
+      </w:r>
+    </w:p>
+    <w:p>
+      <w:pPr>
+        <w:bidi w:val="1"/>
+      </w:pPr>
+      <w:r>
+        <w:rPr>
+          <w:b w:val="0"/>
+          <w:sz w:val="24"/>
+          <w:rtl w:val="1"/>
+        </w:rPr>
+        <w:t>• חברת ניהול ותיווך מקומית שמטפלת באיתור ובסינון שוכרים, בהסכמי השכירות, בגבייה, בתחזוקה ובתפעול השוטף - עם מענה גם בעברית, כך שאפשר להבין את מצב הנכס, לשאול שאלות ולקבל עדכונים בלי להסתמך רק על התכתבויות באנגלית.</w:t>
+      </w:r>
+    </w:p>
+    <w:p>
+      <w:pPr>
+        <w:bidi w:val="1"/>
+      </w:pPr>
+      <w:r>
+        <w:rPr>
+          <w:b w:val="0"/>
+          <w:sz w:val="24"/>
+          <w:rtl w:val="1"/>
+        </w:rPr>
+        <w:t>עבור משקיע ישראלי, המענה בעברית אינו רק עניין של נוחות. כשמחזיקים נכס מעבר לים, חשוב לדעת שיש בשטח גורם שמטפל בנכס בפועל, ובמקביל כתובת ברורה שאפשר לתקשר איתה בצורה פשוטה וישירה.</w:t>
       </w:r>
     </w:p>
     <w:p>
@@ -194,33 +233,7 @@
           <w:sz w:val="24"/>
           <w:rtl w:val="1"/>
         </w:rPr>
-        <w:t>• אפשרות לבחון מימון מסוג DSCR כבר בשלב הרכישה, עד כ-70% ובכפוף לאישור מלווה - משכנתא על שם ה-LLC בקנייה עצמה, לא ריפייננס מאוחר, והלוואה שמבוססת בעיקר על הכנסות הנכס.</w:t>
-      </w:r>
-    </w:p>
-    <w:p>
-      <w:pPr>
-        <w:bidi w:val="1"/>
-      </w:pPr>
-      <w:r>
-        <w:rPr>
-          <w:b w:val="0"/>
-          <w:sz w:val="24"/>
-          <w:rtl w:val="1"/>
-        </w:rPr>
         <w:t>• אפשרות לאכלס את הבית בשוכר בפרק זמן קצר יחסית לאחר הסגירה, במקום להמתין לתכנון ולבנייה.</w:t>
-      </w:r>
-    </w:p>
-    <w:p>
-      <w:pPr>
-        <w:bidi w:val="1"/>
-      </w:pPr>
-      <w:r>
-        <w:rPr>
-          <w:b w:val="0"/>
-          <w:sz w:val="24"/>
-          <w:rtl w:val="1"/>
-        </w:rPr>
-        <w:t>• חברת ניהול ותיווך מקומית שמאתרת שוכר ומנהלת את הנכס בשטח, עם נציג דובר עברית שמגיע לישראל באופן קבוע - כך שהניהול מרחוק לא תלוי במיילים באנגלית.</w:t>
       </w:r>
     </w:p>
     <w:p>

</xml_diff>

<commit_message>
Short page: deeper opening + renders demoted to blurred CTA backdrop
Model-in-brief opening now distills the full deck narrative: value-chain
experience, the where-would-we-put-our-own-money question, and the
thesis that no single advantage suffices - the combination is the model.
Zillow renders (half-strength CGI per Yossi) no longer showcased: the
how-it-looks section is gone, one blurred darkened render remains as
subtle CTA background (15KB; page back down to 867KB).

Co-Authored-By: Claude Fable 5 <noreply@anthropic.com>
</commit_message>
<xml_diff>
--- a/presentation-short.docx
+++ b/presentation-short.docx
@@ -51,7 +51,7 @@
           <w:sz w:val="24"/>
           <w:rtl w:val="1"/>
         </w:rPr>
-        <w:t>אנחנו קבוצת יזמים עצמאית, הפועלת בנדל״ן למעלה מחמש עשרה שנה. לאחר שבחנו לעומק כמה מסלולי השקעה, בחרנו להתמקד ברכישת בתים חדשים מקבלנים ציבוריים גדולים בטקסס: נכס אמיתי, בעלות ברורה, תהליך מסודר ואפשרות להחזיק לאורך זמן.</w:t>
+        <w:t>אנחנו קבוצת יזמים עצמאית, הפועלת בנדל״ן למעלה מחמש עשרה שנה - מאיתור קרקע ותכנון, דרך מימון, ביצוע ופיקוח, ועד אכלוס וניהול נכסים. בשנים האחרונות, כשהשוק השתנה ועלויות המימון עלו, שאלנו את עצמנו שאלה פשוטה: אם היינו משקיעים את כספנו היום - איפה ואיך היינו עושים זאת?</w:t>
       </w:r>
     </w:p>
     <w:p>
@@ -64,7 +64,20 @@
           <w:sz w:val="24"/>
           <w:rtl w:val="1"/>
         </w:rPr>
-        <w:t>המודל מחבר בין נכס פשוט וברור לבין תשתית שמאפשרת למשקיע ישראלי להחזיק ולנהל אותו בצורה מסודרת גם מרחוק:</w:t>
+        <w:t>חיפשנו מודל שיעמוד גם בבדיקה עמוקה, ולא רק כזה שנראה טוב על הנייר. מה ששכנע אותנו לא היה יתרון אחד, אלא השילוב כולו: בית חדש ובנוי מקבלן ציבורי גדול, שנדרש להמשיך למכור גם בסביבת ריבית גבוהה; בעלות עצמאית ומלאה של המשקיע; אפשרות למימון כבר ברכישה; וניהול מקומי שמאפשר להחזיק את הנכס בצורה מסודרת גם מרחוק. כל רכיב לבדו אינו מספיק - ביחד הם המודל.</w:t>
+      </w:r>
+    </w:p>
+    <w:p>
+      <w:pPr>
+        <w:bidi w:val="1"/>
+      </w:pPr>
+      <w:r>
+        <w:rPr>
+          <w:b w:val="0"/>
+          <w:sz w:val="24"/>
+          <w:rtl w:val="1"/>
+        </w:rPr>
+        <w:t>בפועל, זה מה שהמשקיע מקבל:</w:t>
       </w:r>
     </w:p>
     <w:p>

</xml_diff>

<commit_message>
Short page: assertive positives - drop nitan/efsharut before benefits
Yossi copywriting rule: possibility-words before a benefit weaken it.
Financing, occupancy, inspection, Hebrew response and negotiation
lines rewritten in active voice; hedges (lender approval, suitable
cases) kept. The one remaining nitan is negative-context (unforeseen
expenses) and stays by design.

Co-Authored-By: Claude Fable 5 <noreply@anthropic.com>
</commit_message>
<xml_diff>
--- a/presentation-short.docx
+++ b/presentation-short.docx
@@ -64,7 +64,7 @@
           <w:sz w:val="24"/>
           <w:rtl w:val="1"/>
         </w:rPr>
-        <w:t>חיפשנו מודל שיעמוד גם בבדיקה עמוקה, ולא רק כזה שנראה טוב על הנייר. מה ששכנע אותנו לא היה יתרון אחד, אלא השילוב כולו: בית חדש ובנוי מקבלן ציבורי גדול, שנדרש להמשיך למכור גם בסביבת ריבית גבוהה; בעלות עצמאית ומלאה של המשקיע; אפשרות למימון כבר ברכישה; וניהול מקומי שמאפשר להחזיק את הנכס בצורה מסודרת גם מרחוק. כל רכיב לבדו אינו מספיק - ביחד הם המודל.</w:t>
+        <w:t>חיפשנו מודל שיעמוד גם בבדיקה עמוקה, ולא רק כזה שנראה טוב על הנייר. מה ששכנע אותנו לא היה יתרון אחד, אלא השילוב כולו: בית חדש ובנוי מקבלן ציבורי גדול, שנדרש להמשיך למכור גם בסביבת ריבית גבוהה; בעלות עצמאית ומלאה של המשקיע; מימון כבר ברכישה; וניהול מקומי שמחזיק את הנכס בצורה מסודרת גם מרחוק. כל רכיב לבדו אינו מספיק - ביחד הם המודל.</w:t>
       </w:r>
     </w:p>
     <w:p>
@@ -90,7 +90,7 @@
           <w:sz w:val="24"/>
           <w:rtl w:val="1"/>
         </w:rPr>
-        <w:t>• בית חד-משפחתי חדש, בנוי ומוכן, מקבלן ציבורי גדול. בלי קרקע, תכנון או תהליך בנייה - נכס שכבר קיים, ניתן לבדיקה, ויכול לעבור להשכרה בפרק זמן קצר יחסית.</w:t>
+        <w:t>• בית חד-משפחתי חדש, בנוי ומוכן, מקבלן ציבורי גדול. בלי קרקע, תכנון או תהליך בנייה - הבית קיים, עובר בדיקה, ועובר להשכרה בפרק זמן קצר יחסית.</w:t>
       </w:r>
     </w:p>
     <w:p>
@@ -116,7 +116,7 @@
           <w:sz w:val="24"/>
           <w:rtl w:val="1"/>
         </w:rPr>
-        <w:t>• אפשרות לבחון מימון כבר במועד הרכישה: במקרים מתאימים ובכפוף לאישור המלווה, מימון DSCR בשיעור של עד 70% ממחיר הרכישה - כך שהמשקיע אינו נדרש בהכרח לממן את מלוא עלות הבית מהון עצמי.</w:t>
+        <w:t>• מימון כבר במועד הרכישה: מימון DSCR בשיעור של עד 70% ממחיר הרכישה, במקרים מתאימים ובכפוף לאישור המלווה - המשקיע אינו נדרש לממן את מלוא עלות הבית מהון עצמי.</w:t>
       </w:r>
     </w:p>
     <w:p>
@@ -129,7 +129,7 @@
           <w:sz w:val="24"/>
           <w:rtl w:val="1"/>
         </w:rPr>
-        <w:t>• חברת ניהול ותיווך מקומית שמטפלת באיתור ובסינון שוכרים, בהסכמי השכירות, בגבייה, בתחזוקה ובתפעול השוטף - עם מענה גם בעברית, כך שאפשר להבין את מצב הנכס, לשאול שאלות ולקבל עדכונים בלי להסתמך רק על התכתבויות באנגלית.</w:t>
+        <w:t>• חברת ניהול ותיווך מקומית שמטפלת באיתור ובסינון שוכרים, בהסכמי השכירות, בגבייה, בתחזוקה ובתפעול השוטף - עם מענה גם בעברית: מבינים את מצב הנכס, שואלים ומקבלים עדכונים, בלי להסתמך רק על התכתבויות באנגלית.</w:t>
       </w:r>
     </w:p>
     <w:p>
@@ -142,7 +142,7 @@
           <w:sz w:val="24"/>
           <w:rtl w:val="1"/>
         </w:rPr>
-        <w:t>עבור משקיע ישראלי, המענה בעברית אינו רק עניין של נוחות. כשמחזיקים נכס מעבר לים, חשוב לדעת שיש בשטח גורם שמטפל בנכס בפועל, ובמקביל כתובת ברורה שאפשר לתקשר איתה בצורה פשוטה וישירה.</w:t>
+        <w:t>עבור משקיע ישראלי, המענה בעברית אינו רק עניין של נוחות. כשמחזיקים נכס מעבר לים, חשוב לדעת שיש בשטח גורם שמטפל בנכס בפועל, ובמקביל כתובת ברורה שהתקשורת איתה פשוטה וישירה.</w:t>
       </w:r>
     </w:p>
     <w:p>
@@ -168,7 +168,7 @@
           <w:sz w:val="24"/>
           <w:rtl w:val="1"/>
         </w:rPr>
-        <w:t>סביבת הריבית הגבוהה יצרה לחץ גם אצל קבלנים ציבוריים גדולים, שמחזיקים מלאי של בתים חדשים ונדרשים להמשיך למכור. בפגישות שקיימנו עם קבלנים ואנשי מקצוע מקומיים ראינו שבחלק מהמקרים קיימת נכונות גבוהה יותר להציע הטבות, שדרוגים או סיוע בעלויות סגירה. כשהמשקיע מגיע מוכן, עם תשתית מסודרת והון זמין, אפשר לבחון את תנאי העסקה מנקודת פתיחה טובה יותר.</w:t>
+        <w:t>סביבת הריבית הגבוהה יצרה לחץ גם אצל קבלנים ציבוריים גדולים, שמחזיקים מלאי של בתים חדשים ונדרשים להמשיך למכור. בפגישות שקיימנו עם קבלנים ואנשי מקצוע מקומיים ראינו שבחלק מהמקרים קיימת נכונות גבוהה יותר להציע הטבות, שדרוגים או סיוע בעלויות סגירה. כשהמשקיע מגיע מוכן, עם תשתית מסודרת והון זמין, נקודת הפתיחה במשא ומתן משתנה לטובתו.</w:t>
       </w:r>
     </w:p>
     <w:p>
@@ -246,7 +246,7 @@
           <w:sz w:val="24"/>
           <w:rtl w:val="1"/>
         </w:rPr>
-        <w:t>• אפשרות לאכלס את הבית בשוכר בפרק זמן קצר יחסית לאחר הסגירה, במקום להמתין לתכנון ולבנייה.</w:t>
+        <w:t>• הבית מאוכלס בשוכר בפרק זמן קצר יחסית לאחר הסגירה - בלי להמתין לתכנון ולבנייה.</w:t>
       </w:r>
     </w:p>
     <w:p>

</xml_diff>

<commit_message>
Short page: growth-neighborhoods reframed as master-planned mega-communities
Yossi: growth-neighborhood phrasing read as sketchy-area - the reality
is the opposite (Lennar master-planned complexes like Synova and
Newport in Crosby: hundreds of lots, parks, lakes, trails, rec
centers, verified on lennar.com). Gold card, why-Texas paragraph and
why-new-home bullet rewritten around Master-Planned communities.
Builder name kept generic on-page (public giant builders).

Co-Authored-By: Claude Fable 5 <noreply@anthropic.com>
</commit_message>
<xml_diff>
--- a/presentation-short.docx
+++ b/presentation-short.docx
@@ -181,7 +181,7 @@
           <w:sz w:val="24"/>
           <w:rtl w:val="1"/>
         </w:rPr>
-        <w:t>באזור יוסטון רבתי אנחנו מתמקדים במיקומים שנבחנים לפי פרמטרים מעשיים: גידול אוכלוסייה, תעסוקה, ביקוש לשכירות, תשתיות, בתי ספר ושכונות חדשות שממשיכות להתאכלס ולהבשיל.</w:t>
+        <w:t>באזור יוסטון רבתי אנחנו מתמקדים בקהילות מתוכננות (Master-Planned) שקבלני הענק מקימים כמוצר שלם: קומפלקסים של מאות בתים עם פארקים, אגמים, שבילים ומתקני קהילה. המיקומים נבחנים לפי פרמטרים מעשיים - גידול אוכלוסייה, תעסוקה, ביקוש לשכירות, תשתיות ובתי ספר.</w:t>
       </w:r>
     </w:p>
     <w:p>
@@ -259,7 +259,7 @@
           <w:sz w:val="24"/>
           <w:rtl w:val="1"/>
         </w:rPr>
-        <w:t>• שכונות חדשות ומתוכננות, שחלק מהפוטנציאל שלהן נובע מהמשך האכלוס והבשלת הסביבה.</w:t>
+        <w:t>• קהילה מתוכננת שלמה שנבנית כמוצר אחד - פארקים, אגמים, שבילים ומתקני קהילה - סביבה שתוכננה מהיום הראשון למגורים לטווח ארוך.</w:t>
       </w:r>
     </w:p>
     <w:p>

</xml_diff>

<commit_message>
Terminology: investor->buyer across both masters and pages (Amir's legal note)
- כל "משקיע/השקעה" הוחלף ב"רוכש/רכישה" בשני המאסטרים (עריכה כירורגית run-level)
- כותרת מקטע: "איך אנחנו מסתכלים על הרכישה" (עודכן גם באימות build.py)
- דיסקליימר: נוספה שורת "שירותי ליווי, תיאום וניהול תהליך בלבד, איננו מנהלים כספי לקוחות"
- "ייעוץ השקעות" בדיסקליימר נשאר בכוונה (שלילה משפטית)
- כפתורי CTA: "מחשבון השוואה כלכלית" / "מפת האזורים ביוסטון"

Co-Authored-By: Claude Fable 5 <noreply@anthropic.com>
</commit_message>
<xml_diff>
--- a/presentation-short.docx
+++ b/presentation-short.docx
@@ -51,7 +51,7 @@
           <w:sz w:val="24"/>
           <w:rtl w:val="1"/>
         </w:rPr>
-        <w:t>אנחנו קבוצת יזמים עצמאית, הפועלת בנדל״ן למעלה מחמש עשרה שנה - מאיתור קרקע ותכנון, דרך מימון, ביצוע ופיקוח, ועד אכלוס וניהול נכסים. בשנים האחרונות, כשהשוק השתנה ועלויות המימון עלו, שאלנו את עצמנו שאלה פשוטה: אם היינו משקיעים את כספנו היום - איפה ואיך היינו עושים זאת?</w:t>
+        <w:t>אנחנו קבוצת יזמים עצמאית, הפועלת בנדל״ן למעלה מחמש עשרה שנה - מאיתור קרקע ותכנון, דרך מימון, ביצוע ופיקוח, ועד אכלוס וניהול נכסים. בשנים האחרונות, כשהשוק השתנה ועלויות המימון עלו, שאלנו את עצמנו שאלה פשוטה: אם היינו רוכשים נכס בכספנו היום - איפה ואיך היינו עושים זאת?</w:t>
       </w:r>
     </w:p>
     <w:p>
@@ -64,7 +64,7 @@
           <w:sz w:val="24"/>
           <w:rtl w:val="1"/>
         </w:rPr>
-        <w:t>חיפשנו מודל שיעמוד גם בבדיקה עמוקה, ולא רק כזה שנראה טוב על הנייר. מה ששכנע אותנו לא היה יתרון אחד, אלא השילוב כולו: בית חדש ובנוי מקבלן ציבורי גדול, שנדרש להמשיך למכור גם בסביבת ריבית גבוהה; בעלות עצמאית ומלאה של המשקיע; מימון כבר ברכישה; וניהול מקומי שמחזיק את הנכס בצורה מסודרת גם מרחוק. כל רכיב לבדו אינו מספיק - ביחד הם המודל.</w:t>
+        <w:t>חיפשנו מודל שיעמוד גם בבדיקה עמוקה, ולא רק כזה שנראה טוב על הנייר. מה ששכנע אותנו לא היה יתרון אחד, אלא השילוב כולו: בית חדש ובנוי מקבלן ציבורי גדול, שנדרש להמשיך למכור גם בסביבת ריבית גבוהה; בעלות עצמאית ומלאה של הרוכש; מימון כבר ברכישה; וניהול מקומי שמחזיק את הנכס בצורה מסודרת גם מרחוק. כל רכיב לבדו אינו מספיק - ביחד הם המודל.</w:t>
       </w:r>
     </w:p>
     <w:p>
@@ -77,7 +77,7 @@
           <w:sz w:val="24"/>
           <w:rtl w:val="1"/>
         </w:rPr>
-        <w:t>בפועל, זה מה שהמשקיע מקבל:</w:t>
+        <w:t>בפועל, זה מה שהרוכש מקבל:</w:t>
       </w:r>
     </w:p>
     <w:p>
@@ -103,7 +103,7 @@
           <w:sz w:val="24"/>
           <w:rtl w:val="1"/>
         </w:rPr>
-        <w:t>• נכס עצמאי שאינו תלוי במשקיעים אחרים: לכל משקיע מוקמת LLC ייעודית בבעלותו, עם חשבון בנק נפרד, והבית נרשם על שם החברה שלו. אין קופה משותפת ואין תלות בהחלטות של קבוצה.</w:t>
+        <w:t>• נכס עצמאי שאינו תלוי ברוכשים אחרים: לכל רוכש מוקמת LLC ייעודית בבעלותו, עם חשבון בנק נפרד, והבית נרשם על שם החברה שלו. אין קופה משותפת ואין תלות בהחלטות של קבוצה.</w:t>
       </w:r>
     </w:p>
     <w:p>
@@ -116,7 +116,7 @@
           <w:sz w:val="24"/>
           <w:rtl w:val="1"/>
         </w:rPr>
-        <w:t>• מימון כבר במועד הרכישה: מימון DSCR בשיעור של עד 70% ממחיר הרכישה, במקרים מתאימים ובכפוף לאישור המלווה - המשקיע אינו נדרש לממן את מלוא עלות הבית מהון עצמי.</w:t>
+        <w:t>• מימון כבר במועד הרכישה: מימון DSCR בשיעור של עד 70% ממחיר הרכישה, במקרים מתאימים ובכפוף לאישור המלווה - הרוכש אינו נדרש לממן את מלוא עלות הבית מהון עצמי.</w:t>
       </w:r>
     </w:p>
     <w:p>
@@ -142,7 +142,7 @@
           <w:sz w:val="24"/>
           <w:rtl w:val="1"/>
         </w:rPr>
-        <w:t>עבור משקיע ישראלי, המענה בעברית אינו רק עניין של נוחות. כשמחזיקים נכס מעבר לים, חשוב לדעת שיש בשטח גורם שמטפל בנכס בפועל, ובמקביל כתובת ברורה שהתקשורת איתה פשוטה וישירה.</w:t>
+        <w:t>עבור רוכש ישראלי, המענה בעברית אינו רק עניין של נוחות. כשמחזיקים נכס מעבר לים, חשוב לדעת שיש בשטח גורם שמטפל בנכס בפועל, ובמקביל כתובת ברורה שהתקשורת איתה פשוטה וישירה.</w:t>
       </w:r>
     </w:p>
     <w:p>
@@ -168,7 +168,7 @@
           <w:sz w:val="24"/>
           <w:rtl w:val="1"/>
         </w:rPr>
-        <w:t>סביבת הריבית הגבוהה יצרה לחץ גם אצל קבלנים ציבוריים גדולים, שמחזיקים מלאי של בתים חדשים ונדרשים להמשיך למכור. בפגישות שקיימנו עם קבלנים ואנשי מקצוע מקומיים ראינו שבחלק מהמקרים קיימת נכונות גבוהה יותר להציע הטבות, שדרוגים או סיוע בעלויות סגירה. כשהמשקיע מגיע מוכן, עם תשתית מסודרת והון זמין, נקודת הפתיחה במשא ומתן משתנה לטובתו.</w:t>
+        <w:t>סביבת הריבית הגבוהה יצרה לחץ גם אצל קבלנים ציבוריים גדולים, שמחזיקים מלאי של בתים חדשים ונדרשים להמשיך למכור. בפגישות שקיימנו עם קבלנים ואנשי מקצוע מקומיים ראינו שבחלק מהמקרים קיימת נכונות גבוהה יותר להציע הטבות, שדרוגים או סיוע בעלויות סגירה. כשהרוכש מגיע מוכן, עם תשתית מסודרת והון זמין, נקודת הפתיחה במשא ומתן משתנה לטובתו.</w:t>
       </w:r>
     </w:p>
     <w:p>
@@ -272,7 +272,7 @@
           <w:sz w:val="24"/>
           <w:rtl w:val="1"/>
         </w:rPr>
-        <w:t>זה לא הופך את ההשקעה לחסרת סיכון. את המודל בחנו קודם על עצמנו ובעסקאות ראשונות - לא רק ברמת האקסל, אלא גם ברכישה, בסגירה, בניהול ובהשכרה בפועל.</w:t>
+        <w:t>זה לא הופך את הרכישה לחסרת סיכון. את המודל בחנו קודם על עצמנו ובעסקאות ראשונות - לא רק ברמת האקסל, אלא גם ברכישה, בסגירה, בניהול ובהשכרה בפועל.</w:t>
       </w:r>
     </w:p>
     <w:p>
@@ -311,7 +311,7 @@
           <w:sz w:val="24"/>
           <w:rtl w:val="1"/>
         </w:rPr>
-        <w:t>• שיחת התאמה והגדרת מסגרת: הון זמין, העדפת מימון וטווח השקעה.</w:t>
+        <w:t>• שיחת התאמה והגדרת מסגרת: הון זמין, העדפת מימון וטווח החזקה.</w:t>
       </w:r>
     </w:p>
     <w:p>
@@ -376,7 +376,7 @@
           <w:sz w:val="24"/>
           <w:rtl w:val="1"/>
         </w:rPr>
-        <w:t>משקיע שמגיע עם חברה, חשבון בנק והון זמין נתפס כרוכש רציני יותר מול הקבלנים, ומקטין את הסיכון לפספס נכס מתאים בגלל עיכוב טכני.</w:t>
+        <w:t>רוכש שמגיע עם חברה, חשבון בנק והון זמין נתפס כגורם רציני יותר מול הקבלנים, ומקטין את הסיכון לפספס נכס מתאים בגלל עיכוב טכני.</w:t>
       </w:r>
     </w:p>
     <w:p>
@@ -402,7 +402,7 @@
           <w:sz w:val="24"/>
           <w:rtl w:val="1"/>
         </w:rPr>
-        <w:t>כמו בכל השקעת נדל״ן, יש משתנים שצריך להביא בחשבון: תקופות ללא שוכר, תחזוקה, שינויי ריבית ומס, שינויי שוק והוצאות שלא ניתן לצפות מראש. בית חדש ואחריות קבלן אינם מבטלים את הסיכונים, אבל מאפשרים להתחיל מנקודת פתיחה מסודרת וברורה יותר.</w:t>
+        <w:t>כמו בכל רכישת נכס להשכרה, יש משתנים שצריך להביא בחשבון: תקופות ללא שוכר, תחזוקה, שינויי ריבית ומס, שינויי שוק והוצאות שלא ניתן לצפות מראש. בית חדש ואחריות קבלן אינם מבטלים את הסיכונים, אבל מאפשרים להתחיל מנקודת פתיחה מסודרת וברורה יותר.</w:t>
       </w:r>
     </w:p>
     <w:p>
@@ -415,7 +415,7 @@
           <w:sz w:val="24"/>
           <w:rtl w:val="1"/>
         </w:rPr>
-        <w:t>ההשקעה היא בנכס - לא בנו. המשקיע מחזיק ב-LLC ובחשבון הבנק, והבית רשום על שם החברה, בכפוף להסכמי הרכישה, המימון והדין הרלוונטי.</w:t>
+        <w:t>הרכישה היא של הבית, ישירות מהקבלן - לא מאיתנו. הרוכש מחזיק ב-LLC ובחשבון הבנק, והבית רשום על שם החברה, בכפוף להסכמי הרכישה, המימון והדין הרלוונטי.</w:t>
       </w:r>
     </w:p>
     <w:p>
@@ -467,7 +467,7 @@
           <w:sz w:val="24"/>
           <w:rtl w:val="1"/>
         </w:rPr>
-        <w:t>המידע במסמך זה נועד לצורכי הסברה כללית בלבד ואינו מהווה הצעה לרכישת נכס, ייעוץ השקעות, ייעוץ פיננסי, ייעוץ משפטי, ייעוץ מס או התחייבות לתוצאה כלשהי. נתונים, דוגמאות, טווחים ותחזיות שיוצגו בעל פה או בכתב הם אינדיקציות בלבד ועשויים להשתנות בהתאם לשוק ולגורמים שאינם בשליטתנו. כל משקיע נדרש לבצע בדיקות עצמאיות ולהיעזר ביועצים מקצועיים מתאימים לפני קבלת החלטה. המסמך מיועד לנמענים רלוונטיים בלבד ואינו מיועד להפצה פומבית או שימוש מסחרי ללא אישור מראש ובכתב.</w:t>
+        <w:t>המידע במסמך זה נועד לצורכי הסברה כללית בלבד ואינו מהווה הצעה לרכישת נכס, ייעוץ השקעות, ייעוץ פיננסי, ייעוץ משפטי, ייעוץ מס או התחייבות לתוצאה כלשהי. אנו מספקים שירותי איתור, ליווי, תיאום וניהול תהליך בלבד, ואיננו מנהלים או מחזיקים כספי לקוחות. נתונים, דוגמאות, טווחים ותחזיות שיוצגו בעל פה או בכתב הם אינדיקציות בלבד ועשויים להשתנות בהתאם לשוק ולגורמים שאינם בשליטתנו. כל רוכש נדרש לבצע בדיקות עצמאיות ולהיעזר ביועצים מקצועיים מתאימים לפני קבלת החלטה. המסמך מיועד לנמענים רלוונטיים בלבד ואינו מיועד להפצה פומבית או שימוש מסחרי ללא אישור מראש ובכתב.</w:t>
       </w:r>
     </w:p>
     <w:sectPr>

</xml_diff>